<commit_message>
feat: update resume content and formatting in PDF and DOCX files
</commit_message>
<xml_diff>
--- a/public/resume/Harsh_Dadiya_Resume.docx
+++ b/public/resume/Harsh_Dadiya_Resume.docx
@@ -108,553 +108,6 @@
       <w:r>
         <w:t>AI Engineer with hands-on experience designing, deploying, and scaling enterprise AI systems, multi-agent architectures, cloud-native applications, and workflow automation platforms. Specialized in building production-grade AI solutions leveraging large language models, agent frameworks, MCP-based integrations, retrieval systems, and real-time conversational AI. Proven expertise in Anthropic-managed agents, Agent SDKs, AI workflow orchestration, and enterprise-grade automation that improves operational efficiency and business productivity.</w:t>
       </w:r>
-    </w:p>
-    <w:p>
-      <w:pPr>
-        <w:keepNext/>
-        <w:keepLines/>
-        <w:pBdr>
-          <w:bottom w:val="single" w:sz="6" w:space="4" w:color="1F6F5C"/>
-        </w:pBdr>
-        <w:spacing w:before="320" w:after="120"/>
-      </w:pPr>
-      <w:r>
-        <w:rPr>
-          <w:b/>
-          <w:bCs/>
-          <w:color w:val="1F6F5C"/>
-          <w:spacing w:val="20"/>
-          <w:sz w:val="24"/>
-          <w:szCs w:val="24"/>
-        </w:rPr>
-        <w:t>CORE COMPETENCIES</w:t>
-      </w:r>
-    </w:p>
-    <w:tbl>
-      <w:tblPr>
-        <w:tblW w:w="10485" w:type="dxa"/>
-        <w:tblBorders>
-          <w:top w:val="single" w:sz="4" w:space="0" w:color="auto"/>
-          <w:left w:val="single" w:sz="4" w:space="0" w:color="auto"/>
-          <w:bottom w:val="single" w:sz="4" w:space="0" w:color="auto"/>
-          <w:right w:val="single" w:sz="4" w:space="0" w:color="auto"/>
-          <w:insideH w:val="single" w:sz="4" w:space="0" w:color="auto"/>
-          <w:insideV w:val="single" w:sz="4" w:space="0" w:color="auto"/>
-        </w:tblBorders>
-        <w:tblCellMar>
-          <w:left w:w="10" w:type="dxa"/>
-          <w:right w:w="10" w:type="dxa"/>
-        </w:tblCellMar>
-        <w:tblLook w:val="04A0" w:firstRow="1" w:lastRow="0" w:firstColumn="1" w:lastColumn="0" w:noHBand="0" w:noVBand="1"/>
-      </w:tblPr>
-      <w:tblGrid>
-        <w:gridCol w:w="3120"/>
-        <w:gridCol w:w="3396"/>
-        <w:gridCol w:w="3969"/>
-      </w:tblGrid>
-      <w:tr>
-        <w:tc>
-          <w:tcPr>
-            <w:tcW w:w="3120" w:type="dxa"/>
-            <w:tcBorders>
-              <w:top w:val="single" w:sz="4" w:space="0" w:color="BFBFBF"/>
-              <w:left w:val="single" w:sz="4" w:space="0" w:color="BFBFBF"/>
-              <w:bottom w:val="single" w:sz="4" w:space="0" w:color="BFBFBF"/>
-              <w:right w:val="single" w:sz="4" w:space="0" w:color="BFBFBF"/>
-            </w:tcBorders>
-            <w:tcMar>
-              <w:top w:w="100" w:type="dxa"/>
-              <w:left w:w="140" w:type="dxa"/>
-              <w:bottom w:w="100" w:type="dxa"/>
-              <w:right w:w="140" w:type="dxa"/>
-            </w:tcMar>
-            <w:vAlign w:val="center"/>
-          </w:tcPr>
-          <w:p>
-            <w:r>
-              <w:rPr>
-                <w:sz w:val="20"/>
-                <w:szCs w:val="20"/>
-              </w:rPr>
-              <w:t>Agentic AI Systems</w:t>
-            </w:r>
-          </w:p>
-        </w:tc>
-        <w:tc>
-          <w:tcPr>
-            <w:tcW w:w="3396" w:type="dxa"/>
-            <w:tcBorders>
-              <w:top w:val="single" w:sz="4" w:space="0" w:color="BFBFBF"/>
-              <w:left w:val="single" w:sz="4" w:space="0" w:color="BFBFBF"/>
-              <w:bottom w:val="single" w:sz="4" w:space="0" w:color="BFBFBF"/>
-              <w:right w:val="single" w:sz="4" w:space="0" w:color="BFBFBF"/>
-            </w:tcBorders>
-            <w:tcMar>
-              <w:top w:w="100" w:type="dxa"/>
-              <w:left w:w="140" w:type="dxa"/>
-              <w:bottom w:w="100" w:type="dxa"/>
-              <w:right w:w="140" w:type="dxa"/>
-            </w:tcMar>
-            <w:vAlign w:val="center"/>
-          </w:tcPr>
-          <w:p>
-            <w:r>
-              <w:rPr>
-                <w:sz w:val="20"/>
-                <w:szCs w:val="20"/>
-              </w:rPr>
-              <w:t>Multi-Agent Architectures</w:t>
-            </w:r>
-          </w:p>
-        </w:tc>
-        <w:tc>
-          <w:tcPr>
-            <w:tcW w:w="3969" w:type="dxa"/>
-            <w:tcBorders>
-              <w:top w:val="single" w:sz="4" w:space="0" w:color="BFBFBF"/>
-              <w:left w:val="single" w:sz="4" w:space="0" w:color="BFBFBF"/>
-              <w:bottom w:val="single" w:sz="4" w:space="0" w:color="BFBFBF"/>
-              <w:right w:val="single" w:sz="4" w:space="0" w:color="BFBFBF"/>
-            </w:tcBorders>
-            <w:tcMar>
-              <w:top w:w="100" w:type="dxa"/>
-              <w:left w:w="140" w:type="dxa"/>
-              <w:bottom w:w="100" w:type="dxa"/>
-              <w:right w:w="140" w:type="dxa"/>
-            </w:tcMar>
-            <w:vAlign w:val="center"/>
-          </w:tcPr>
-          <w:p>
-            <w:r>
-              <w:rPr>
-                <w:sz w:val="20"/>
-                <w:szCs w:val="20"/>
-              </w:rPr>
-              <w:t>Anthropic Claude Managed Agents</w:t>
-            </w:r>
-          </w:p>
-        </w:tc>
-      </w:tr>
-      <w:tr>
-        <w:tc>
-          <w:tcPr>
-            <w:tcW w:w="3120" w:type="dxa"/>
-            <w:tcBorders>
-              <w:top w:val="single" w:sz="4" w:space="0" w:color="BFBFBF"/>
-              <w:left w:val="single" w:sz="4" w:space="0" w:color="BFBFBF"/>
-              <w:bottom w:val="single" w:sz="4" w:space="0" w:color="BFBFBF"/>
-              <w:right w:val="single" w:sz="4" w:space="0" w:color="BFBFBF"/>
-            </w:tcBorders>
-            <w:tcMar>
-              <w:top w:w="100" w:type="dxa"/>
-              <w:left w:w="140" w:type="dxa"/>
-              <w:bottom w:w="100" w:type="dxa"/>
-              <w:right w:w="140" w:type="dxa"/>
-            </w:tcMar>
-            <w:vAlign w:val="center"/>
-          </w:tcPr>
-          <w:p>
-            <w:r>
-              <w:rPr>
-                <w:sz w:val="20"/>
-                <w:szCs w:val="20"/>
-              </w:rPr>
-              <w:t>Claude Agent SDK</w:t>
-            </w:r>
-          </w:p>
-        </w:tc>
-        <w:tc>
-          <w:tcPr>
-            <w:tcW w:w="3396" w:type="dxa"/>
-            <w:tcBorders>
-              <w:top w:val="single" w:sz="4" w:space="0" w:color="BFBFBF"/>
-              <w:left w:val="single" w:sz="4" w:space="0" w:color="BFBFBF"/>
-              <w:bottom w:val="single" w:sz="4" w:space="0" w:color="BFBFBF"/>
-              <w:right w:val="single" w:sz="4" w:space="0" w:color="BFBFBF"/>
-            </w:tcBorders>
-            <w:tcMar>
-              <w:top w:w="100" w:type="dxa"/>
-              <w:left w:w="140" w:type="dxa"/>
-              <w:bottom w:w="100" w:type="dxa"/>
-              <w:right w:w="140" w:type="dxa"/>
-            </w:tcMar>
-            <w:vAlign w:val="center"/>
-          </w:tcPr>
-          <w:p>
-            <w:r>
-              <w:rPr>
-                <w:sz w:val="20"/>
-                <w:szCs w:val="20"/>
-              </w:rPr>
-              <w:t>Model Context Protocol Servers and Clients</w:t>
-            </w:r>
-          </w:p>
-        </w:tc>
-        <w:tc>
-          <w:tcPr>
-            <w:tcW w:w="3969" w:type="dxa"/>
-            <w:tcBorders>
-              <w:top w:val="single" w:sz="4" w:space="0" w:color="BFBFBF"/>
-              <w:left w:val="single" w:sz="4" w:space="0" w:color="BFBFBF"/>
-              <w:bottom w:val="single" w:sz="4" w:space="0" w:color="BFBFBF"/>
-              <w:right w:val="single" w:sz="4" w:space="0" w:color="BFBFBF"/>
-            </w:tcBorders>
-            <w:tcMar>
-              <w:top w:w="100" w:type="dxa"/>
-              <w:left w:w="140" w:type="dxa"/>
-              <w:bottom w:w="100" w:type="dxa"/>
-              <w:right w:w="140" w:type="dxa"/>
-            </w:tcMar>
-            <w:vAlign w:val="center"/>
-          </w:tcPr>
-          <w:p>
-            <w:r>
-              <w:rPr>
-                <w:sz w:val="20"/>
-                <w:szCs w:val="20"/>
-              </w:rPr>
-              <w:t>Enterprise AI Automation</w:t>
-            </w:r>
-          </w:p>
-        </w:tc>
-      </w:tr>
-      <w:tr>
-        <w:tc>
-          <w:tcPr>
-            <w:tcW w:w="3120" w:type="dxa"/>
-            <w:tcBorders>
-              <w:top w:val="single" w:sz="4" w:space="0" w:color="BFBFBF"/>
-              <w:left w:val="single" w:sz="4" w:space="0" w:color="BFBFBF"/>
-              <w:bottom w:val="single" w:sz="4" w:space="0" w:color="BFBFBF"/>
-              <w:right w:val="single" w:sz="4" w:space="0" w:color="BFBFBF"/>
-            </w:tcBorders>
-            <w:tcMar>
-              <w:top w:w="100" w:type="dxa"/>
-              <w:left w:w="140" w:type="dxa"/>
-              <w:bottom w:w="100" w:type="dxa"/>
-              <w:right w:w="140" w:type="dxa"/>
-            </w:tcMar>
-            <w:vAlign w:val="center"/>
-          </w:tcPr>
-          <w:p>
-            <w:r>
-              <w:rPr>
-                <w:sz w:val="20"/>
-                <w:szCs w:val="20"/>
-              </w:rPr>
-              <w:t>AI Workflow Orchestration</w:t>
-            </w:r>
-          </w:p>
-        </w:tc>
-        <w:tc>
-          <w:tcPr>
-            <w:tcW w:w="3396" w:type="dxa"/>
-            <w:tcBorders>
-              <w:top w:val="single" w:sz="4" w:space="0" w:color="BFBFBF"/>
-              <w:left w:val="single" w:sz="4" w:space="0" w:color="BFBFBF"/>
-              <w:bottom w:val="single" w:sz="4" w:space="0" w:color="BFBFBF"/>
-              <w:right w:val="single" w:sz="4" w:space="0" w:color="BFBFBF"/>
-            </w:tcBorders>
-            <w:tcMar>
-              <w:top w:w="100" w:type="dxa"/>
-              <w:left w:w="140" w:type="dxa"/>
-              <w:bottom w:w="100" w:type="dxa"/>
-              <w:right w:w="140" w:type="dxa"/>
-            </w:tcMar>
-            <w:vAlign w:val="center"/>
-          </w:tcPr>
-          <w:p>
-            <w:r>
-              <w:rPr>
-                <w:sz w:val="20"/>
-                <w:szCs w:val="20"/>
-              </w:rPr>
-              <w:t>Large Language Models (LLMs)</w:t>
-            </w:r>
-          </w:p>
-        </w:tc>
-        <w:tc>
-          <w:tcPr>
-            <w:tcW w:w="3969" w:type="dxa"/>
-            <w:tcBorders>
-              <w:top w:val="single" w:sz="4" w:space="0" w:color="BFBFBF"/>
-              <w:left w:val="single" w:sz="4" w:space="0" w:color="BFBFBF"/>
-              <w:bottom w:val="single" w:sz="4" w:space="0" w:color="BFBFBF"/>
-              <w:right w:val="single" w:sz="4" w:space="0" w:color="BFBFBF"/>
-            </w:tcBorders>
-            <w:tcMar>
-              <w:top w:w="100" w:type="dxa"/>
-              <w:left w:w="140" w:type="dxa"/>
-              <w:bottom w:w="100" w:type="dxa"/>
-              <w:right w:w="140" w:type="dxa"/>
-            </w:tcMar>
-            <w:vAlign w:val="center"/>
-          </w:tcPr>
-          <w:p>
-            <w:r>
-              <w:rPr>
-                <w:sz w:val="20"/>
-                <w:szCs w:val="20"/>
-              </w:rPr>
-              <w:t>RAG Pipelines</w:t>
-            </w:r>
-          </w:p>
-        </w:tc>
-      </w:tr>
-      <w:tr>
-        <w:tc>
-          <w:tcPr>
-            <w:tcW w:w="3120" w:type="dxa"/>
-            <w:tcBorders>
-              <w:top w:val="single" w:sz="4" w:space="0" w:color="BFBFBF"/>
-              <w:left w:val="single" w:sz="4" w:space="0" w:color="BFBFBF"/>
-              <w:bottom w:val="single" w:sz="4" w:space="0" w:color="BFBFBF"/>
-              <w:right w:val="single" w:sz="4" w:space="0" w:color="BFBFBF"/>
-            </w:tcBorders>
-            <w:tcMar>
-              <w:top w:w="100" w:type="dxa"/>
-              <w:left w:w="140" w:type="dxa"/>
-              <w:bottom w:w="100" w:type="dxa"/>
-              <w:right w:w="140" w:type="dxa"/>
-            </w:tcMar>
-            <w:vAlign w:val="center"/>
-          </w:tcPr>
-          <w:p>
-            <w:r>
-              <w:rPr>
-                <w:sz w:val="20"/>
-                <w:szCs w:val="20"/>
-              </w:rPr>
-              <w:t>Conversational AI</w:t>
-            </w:r>
-          </w:p>
-        </w:tc>
-        <w:tc>
-          <w:tcPr>
-            <w:tcW w:w="3396" w:type="dxa"/>
-            <w:tcBorders>
-              <w:top w:val="single" w:sz="4" w:space="0" w:color="BFBFBF"/>
-              <w:left w:val="single" w:sz="4" w:space="0" w:color="BFBFBF"/>
-              <w:bottom w:val="single" w:sz="4" w:space="0" w:color="BFBFBF"/>
-              <w:right w:val="single" w:sz="4" w:space="0" w:color="BFBFBF"/>
-            </w:tcBorders>
-            <w:tcMar>
-              <w:top w:w="100" w:type="dxa"/>
-              <w:left w:w="140" w:type="dxa"/>
-              <w:bottom w:w="100" w:type="dxa"/>
-              <w:right w:w="140" w:type="dxa"/>
-            </w:tcMar>
-            <w:vAlign w:val="center"/>
-          </w:tcPr>
-          <w:p>
-            <w:r>
-              <w:rPr>
-                <w:sz w:val="20"/>
-                <w:szCs w:val="20"/>
-              </w:rPr>
-              <w:t>Real-Time Voice Agents</w:t>
-            </w:r>
-          </w:p>
-        </w:tc>
-        <w:tc>
-          <w:tcPr>
-            <w:tcW w:w="3969" w:type="dxa"/>
-            <w:tcBorders>
-              <w:top w:val="single" w:sz="4" w:space="0" w:color="BFBFBF"/>
-              <w:left w:val="single" w:sz="4" w:space="0" w:color="BFBFBF"/>
-              <w:bottom w:val="single" w:sz="4" w:space="0" w:color="BFBFBF"/>
-              <w:right w:val="single" w:sz="4" w:space="0" w:color="BFBFBF"/>
-            </w:tcBorders>
-            <w:tcMar>
-              <w:top w:w="100" w:type="dxa"/>
-              <w:left w:w="140" w:type="dxa"/>
-              <w:bottom w:w="100" w:type="dxa"/>
-              <w:right w:w="140" w:type="dxa"/>
-            </w:tcMar>
-            <w:vAlign w:val="center"/>
-          </w:tcPr>
-          <w:p>
-            <w:r>
-              <w:rPr>
-                <w:sz w:val="20"/>
-                <w:szCs w:val="20"/>
-              </w:rPr>
-              <w:t>Cloud Architecture (AWS, Bedrock)</w:t>
-            </w:r>
-          </w:p>
-        </w:tc>
-      </w:tr>
-      <w:tr>
-        <w:tc>
-          <w:tcPr>
-            <w:tcW w:w="3120" w:type="dxa"/>
-            <w:tcBorders>
-              <w:top w:val="single" w:sz="4" w:space="0" w:color="BFBFBF"/>
-              <w:left w:val="single" w:sz="4" w:space="0" w:color="BFBFBF"/>
-              <w:bottom w:val="single" w:sz="4" w:space="0" w:color="BFBFBF"/>
-              <w:right w:val="single" w:sz="4" w:space="0" w:color="BFBFBF"/>
-            </w:tcBorders>
-            <w:tcMar>
-              <w:top w:w="100" w:type="dxa"/>
-              <w:left w:w="140" w:type="dxa"/>
-              <w:bottom w:w="100" w:type="dxa"/>
-              <w:right w:w="140" w:type="dxa"/>
-            </w:tcMar>
-            <w:vAlign w:val="center"/>
-          </w:tcPr>
-          <w:p>
-            <w:r>
-              <w:rPr>
-                <w:sz w:val="20"/>
-                <w:szCs w:val="20"/>
-              </w:rPr>
-              <w:t>Microservices &amp; API Design</w:t>
-            </w:r>
-          </w:p>
-        </w:tc>
-        <w:tc>
-          <w:tcPr>
-            <w:tcW w:w="3396" w:type="dxa"/>
-            <w:tcBorders>
-              <w:top w:val="single" w:sz="4" w:space="0" w:color="BFBFBF"/>
-              <w:left w:val="single" w:sz="4" w:space="0" w:color="BFBFBF"/>
-              <w:bottom w:val="single" w:sz="4" w:space="0" w:color="BFBFBF"/>
-              <w:right w:val="single" w:sz="4" w:space="0" w:color="BFBFBF"/>
-            </w:tcBorders>
-            <w:tcMar>
-              <w:top w:w="100" w:type="dxa"/>
-              <w:left w:w="140" w:type="dxa"/>
-              <w:bottom w:w="100" w:type="dxa"/>
-              <w:right w:w="140" w:type="dxa"/>
-            </w:tcMar>
-            <w:vAlign w:val="center"/>
-          </w:tcPr>
-          <w:p>
-            <w:r>
-              <w:rPr>
-                <w:sz w:val="20"/>
-                <w:szCs w:val="20"/>
-              </w:rPr>
-              <w:t>Enterprise Integrations</w:t>
-            </w:r>
-          </w:p>
-        </w:tc>
-        <w:tc>
-          <w:tcPr>
-            <w:tcW w:w="3969" w:type="dxa"/>
-            <w:tcBorders>
-              <w:top w:val="single" w:sz="4" w:space="0" w:color="BFBFBF"/>
-              <w:left w:val="single" w:sz="4" w:space="0" w:color="BFBFBF"/>
-              <w:bottom w:val="single" w:sz="4" w:space="0" w:color="BFBFBF"/>
-              <w:right w:val="single" w:sz="4" w:space="0" w:color="BFBFBF"/>
-            </w:tcBorders>
-            <w:tcMar>
-              <w:top w:w="100" w:type="dxa"/>
-              <w:left w:w="140" w:type="dxa"/>
-              <w:bottom w:w="100" w:type="dxa"/>
-              <w:right w:w="140" w:type="dxa"/>
-            </w:tcMar>
-            <w:vAlign w:val="center"/>
-          </w:tcPr>
-          <w:p>
-            <w:r>
-              <w:rPr>
-                <w:sz w:val="20"/>
-                <w:szCs w:val="20"/>
-              </w:rPr>
-              <w:t>Knowledge Management</w:t>
-            </w:r>
-          </w:p>
-        </w:tc>
-      </w:tr>
-      <w:tr>
-        <w:tc>
-          <w:tcPr>
-            <w:tcW w:w="3120" w:type="dxa"/>
-            <w:tcBorders>
-              <w:top w:val="single" w:sz="4" w:space="0" w:color="BFBFBF"/>
-              <w:left w:val="single" w:sz="4" w:space="0" w:color="BFBFBF"/>
-              <w:bottom w:val="single" w:sz="4" w:space="0" w:color="BFBFBF"/>
-              <w:right w:val="single" w:sz="4" w:space="0" w:color="BFBFBF"/>
-            </w:tcBorders>
-            <w:tcMar>
-              <w:top w:w="100" w:type="dxa"/>
-              <w:left w:w="140" w:type="dxa"/>
-              <w:bottom w:w="100" w:type="dxa"/>
-              <w:right w:w="140" w:type="dxa"/>
-            </w:tcMar>
-            <w:vAlign w:val="center"/>
-          </w:tcPr>
-          <w:p>
-            <w:r>
-              <w:rPr>
-                <w:sz w:val="20"/>
-                <w:szCs w:val="20"/>
-              </w:rPr>
-              <w:t>Semantic &amp; Vector Search</w:t>
-            </w:r>
-          </w:p>
-        </w:tc>
-        <w:tc>
-          <w:tcPr>
-            <w:tcW w:w="3396" w:type="dxa"/>
-            <w:tcBorders>
-              <w:top w:val="single" w:sz="4" w:space="0" w:color="BFBFBF"/>
-              <w:left w:val="single" w:sz="4" w:space="0" w:color="BFBFBF"/>
-              <w:bottom w:val="single" w:sz="4" w:space="0" w:color="BFBFBF"/>
-              <w:right w:val="single" w:sz="4" w:space="0" w:color="BFBFBF"/>
-            </w:tcBorders>
-            <w:tcMar>
-              <w:top w:w="100" w:type="dxa"/>
-              <w:left w:w="140" w:type="dxa"/>
-              <w:bottom w:w="100" w:type="dxa"/>
-              <w:right w:w="140" w:type="dxa"/>
-            </w:tcMar>
-            <w:vAlign w:val="center"/>
-          </w:tcPr>
-          <w:p>
-            <w:r>
-              <w:rPr>
-                <w:sz w:val="20"/>
-                <w:szCs w:val="20"/>
-              </w:rPr>
-              <w:t>AI Platform Engineering</w:t>
-            </w:r>
-          </w:p>
-        </w:tc>
-        <w:tc>
-          <w:tcPr>
-            <w:tcW w:w="3969" w:type="dxa"/>
-            <w:tcBorders>
-              <w:top w:val="single" w:sz="4" w:space="0" w:color="BFBFBF"/>
-              <w:left w:val="single" w:sz="4" w:space="0" w:color="BFBFBF"/>
-              <w:bottom w:val="single" w:sz="4" w:space="0" w:color="BFBFBF"/>
-              <w:right w:val="single" w:sz="4" w:space="0" w:color="BFBFBF"/>
-            </w:tcBorders>
-            <w:tcMar>
-              <w:top w:w="100" w:type="dxa"/>
-              <w:left w:w="140" w:type="dxa"/>
-              <w:bottom w:w="100" w:type="dxa"/>
-              <w:right w:w="140" w:type="dxa"/>
-            </w:tcMar>
-            <w:vAlign w:val="center"/>
-          </w:tcPr>
-          <w:p>
-            <w:r>
-              <w:rPr>
-                <w:sz w:val="20"/>
-                <w:szCs w:val="20"/>
-              </w:rPr>
-              <w:t>Prompt Engineering</w:t>
-            </w:r>
-          </w:p>
-        </w:tc>
-      </w:tr>
-    </w:tbl>
-    <w:p>
-      <w:pPr>
-        <w:spacing w:after="160"/>
-      </w:pPr>
     </w:p>
     <w:p>
       <w:pPr>
@@ -973,44 +426,12 @@
                 <w:sz w:val="20"/>
                 <w:szCs w:val="20"/>
               </w:rPr>
-              <w:t>Slack, Jira, Notion, Google Workspace (Calendar, Gmail), Microsoft Graph / Outlook</w:t>
-            </w:r>
-          </w:p>
-          <w:p>
-            <w:pPr>
-              <w:spacing w:after="40"/>
-            </w:pPr>
-            <w:r>
-              <w:rPr>
-                <w:sz w:val="20"/>
-                <w:szCs w:val="20"/>
-              </w:rPr>
               <w:t>Twilio, MCP Servers, OAuth</w:t>
             </w:r>
           </w:p>
         </w:tc>
       </w:tr>
     </w:tbl>
-    <w:p>
-      <w:pPr>
-        <w:spacing w:after="160"/>
-      </w:pPr>
-    </w:p>
-    <w:p>
-      <w:pPr>
-        <w:spacing w:after="160"/>
-      </w:pPr>
-    </w:p>
-    <w:p>
-      <w:pPr>
-        <w:spacing w:after="160"/>
-      </w:pPr>
-    </w:p>
-    <w:p>
-      <w:pPr>
-        <w:spacing w:after="160"/>
-      </w:pPr>
-    </w:p>
     <w:p>
       <w:pPr>
         <w:spacing w:after="160"/>
@@ -1034,7 +455,6 @@
           <w:sz w:val="24"/>
           <w:szCs w:val="24"/>
         </w:rPr>
-        <w:lastRenderedPageBreak/>
         <w:t>PROFESSIONAL EXPERIENCE</w:t>
       </w:r>
     </w:p>
@@ -1339,6 +759,7 @@
         <w:spacing w:after="60"/>
       </w:pPr>
       <w:r>
+        <w:lastRenderedPageBreak/>
         <w:t>Contributed to development of AI-driven solutions and learned production-level implementation.</w:t>
       </w:r>
     </w:p>
@@ -1597,7 +1018,6 @@
           <w:sz w:val="22"/>
           <w:szCs w:val="22"/>
         </w:rPr>
-        <w:lastRenderedPageBreak/>
         <w:t>SQL Agent Tool — Natural Language to SQL Converter</w:t>
       </w:r>
     </w:p>
@@ -2037,6 +1457,7 @@
         <w:spacing w:after="60"/>
       </w:pPr>
       <w:r>
+        <w:lastRenderedPageBreak/>
         <w:t>HackerRank Certified — Python Programming and Data Structures.</w:t>
       </w:r>
     </w:p>

</xml_diff>